<commit_message>
sua lai bao cao Dat
</commit_message>
<xml_diff>
--- a/Homework 01/BaoCao_Homework01.docx
+++ b/Homework 01/BaoCao_Homework01.docx
@@ -27,7 +27,6 @@
     <w:p>
       <w:pPr>
         <w:rPr>
-          <w:rFonts w:hint="eastAsia"/>
           <w:lang w:eastAsia="ja-JP"/>
         </w:rPr>
       </w:pPr>
@@ -84,7 +83,6 @@
     <w:p>
       <w:pPr>
         <w:rPr>
-          <w:rFonts w:hint="eastAsia"/>
           <w:lang w:eastAsia="ja-JP"/>
         </w:rPr>
       </w:pPr>
@@ -110,6 +108,9 @@
     <w:p/>
     <w:p>
       <w:r>
+        <w:rPr>
+          <w:noProof/>
+        </w:rPr>
         <w:drawing>
           <wp:inline distT="0" distB="0" distL="0" distR="0" wp14:anchorId="3ACC6E09" wp14:editId="2F87C2B9">
             <wp:extent cx="5486400" cy="2535555"/>
@@ -158,6 +159,9 @@
     </w:p>
     <w:p>
       <w:r>
+        <w:rPr>
+          <w:noProof/>
+        </w:rPr>
         <w:drawing>
           <wp:inline distT="0" distB="0" distL="0" distR="0" wp14:anchorId="53FB0AFF" wp14:editId="6B32C0CF">
             <wp:extent cx="5486400" cy="2354580"/>
@@ -206,6 +210,9 @@
     </w:p>
     <w:p>
       <w:r>
+        <w:rPr>
+          <w:noProof/>
+        </w:rPr>
         <w:drawing>
           <wp:inline distT="0" distB="0" distL="0" distR="0" wp14:anchorId="00689CF7" wp14:editId="29F5857F">
             <wp:extent cx="5662047" cy="2087880"/>
@@ -254,10 +261,10 @@
     <w:p>
       <w:r>
         <w:drawing>
-          <wp:inline distT="0" distB="0" distL="0" distR="0" wp14:anchorId="78408499" wp14:editId="70580868">
-            <wp:extent cx="5486400" cy="4490085"/>
-            <wp:effectExtent l="0" t="0" r="0" b="5715"/>
-            <wp:docPr id="1254591245" name="Picture 1"/>
+          <wp:inline distT="0" distB="0" distL="0" distR="0" wp14:anchorId="7799BDE6" wp14:editId="18A92B59">
+            <wp:extent cx="5486400" cy="2560955"/>
+            <wp:effectExtent l="0" t="0" r="0" b="0"/>
+            <wp:docPr id="1403208249" name="Picture 1"/>
             <wp:cNvGraphicFramePr>
               <a:graphicFrameLocks xmlns:a="http://schemas.openxmlformats.org/drawingml/2006/main" noChangeAspect="1"/>
             </wp:cNvGraphicFramePr>
@@ -265,7 +272,7 @@
               <a:graphicData uri="http://schemas.openxmlformats.org/drawingml/2006/picture">
                 <pic:pic xmlns:pic="http://schemas.openxmlformats.org/drawingml/2006/picture">
                   <pic:nvPicPr>
-                    <pic:cNvPr id="1254591245" name=""/>
+                    <pic:cNvPr id="1403208249" name=""/>
                     <pic:cNvPicPr/>
                   </pic:nvPicPr>
                   <pic:blipFill>
@@ -277,7 +284,7 @@
                   <pic:spPr>
                     <a:xfrm>
                       <a:off x="0" y="0"/>
-                      <a:ext cx="5486400" cy="4490085"/>
+                      <a:ext cx="5486400" cy="2560955"/>
                     </a:xfrm>
                     <a:prstGeom prst="rect">
                       <a:avLst/>
@@ -468,16 +475,14 @@
         <w:t>8. Thao tác Git đã thực hiện</w:t>
       </w:r>
     </w:p>
+    <w:p/>
     <w:p>
       <w:r>
-        <w:rPr>
-          <w:noProof/>
-        </w:rPr>
         <w:drawing>
-          <wp:inline distT="0" distB="0" distL="0" distR="0" wp14:anchorId="375A5BE9" wp14:editId="753B2379">
-            <wp:extent cx="5486400" cy="2738120"/>
-            <wp:effectExtent l="0" t="0" r="0" b="5080"/>
-            <wp:docPr id="1409969343" name="Picture 1"/>
+          <wp:inline distT="0" distB="0" distL="0" distR="0" wp14:anchorId="4E7BF4AA" wp14:editId="59813E2F">
+            <wp:extent cx="5486400" cy="2970530"/>
+            <wp:effectExtent l="0" t="0" r="0" b="1270"/>
+            <wp:docPr id="1463664063" name="Picture 1"/>
             <wp:cNvGraphicFramePr>
               <a:graphicFrameLocks xmlns:a="http://schemas.openxmlformats.org/drawingml/2006/main" noChangeAspect="1"/>
             </wp:cNvGraphicFramePr>
@@ -485,7 +490,7 @@
               <a:graphicData uri="http://schemas.openxmlformats.org/drawingml/2006/picture">
                 <pic:pic xmlns:pic="http://schemas.openxmlformats.org/drawingml/2006/picture">
                   <pic:nvPicPr>
-                    <pic:cNvPr id="1409969343" name=""/>
+                    <pic:cNvPr id="1463664063" name=""/>
                     <pic:cNvPicPr/>
                   </pic:nvPicPr>
                   <pic:blipFill>
@@ -497,67 +502,11 @@
                   <pic:spPr>
                     <a:xfrm>
                       <a:off x="0" y="0"/>
-                      <a:ext cx="5486400" cy="2738120"/>
+                      <a:ext cx="5486400" cy="2970530"/>
                     </a:xfrm>
                     <a:prstGeom prst="rect">
                       <a:avLst/>
                     </a:prstGeom>
-                  </pic:spPr>
-                </pic:pic>
-              </a:graphicData>
-            </a:graphic>
-          </wp:inline>
-        </w:drawing>
-      </w:r>
-    </w:p>
-    <w:p>
-      <w:r>
-        <w:rPr>
-          <w:noProof/>
-        </w:rPr>
-        <w:lastRenderedPageBreak/>
-        <w:drawing>
-          <wp:inline distT="0" distB="0" distL="0" distR="0" wp14:anchorId="221ED6E5" wp14:editId="30215249">
-            <wp:extent cx="5486400" cy="3771900"/>
-            <wp:effectExtent l="0" t="0" r="0" b="0"/>
-            <wp:docPr id="1139956437" name="Picture 3"/>
-            <wp:cNvGraphicFramePr>
-              <a:graphicFrameLocks xmlns:a="http://schemas.openxmlformats.org/drawingml/2006/main" noChangeAspect="1"/>
-            </wp:cNvGraphicFramePr>
-            <a:graphic xmlns:a="http://schemas.openxmlformats.org/drawingml/2006/main">
-              <a:graphicData uri="http://schemas.openxmlformats.org/drawingml/2006/picture">
-                <pic:pic xmlns:pic="http://schemas.openxmlformats.org/drawingml/2006/picture">
-                  <pic:nvPicPr>
-                    <pic:cNvPr id="0" name="Picture 5"/>
-                    <pic:cNvPicPr>
-                      <a:picLocks noChangeAspect="1" noChangeArrowheads="1"/>
-                    </pic:cNvPicPr>
-                  </pic:nvPicPr>
-                  <pic:blipFill>
-                    <a:blip r:embed="rId14">
-                      <a:extLst>
-                        <a:ext uri="{28A0092B-C50C-407E-A947-70E740481C1C}">
-                          <a14:useLocalDpi xmlns:a14="http://schemas.microsoft.com/office/drawing/2010/main" val="0"/>
-                        </a:ext>
-                      </a:extLst>
-                    </a:blip>
-                    <a:srcRect/>
-                    <a:stretch>
-                      <a:fillRect/>
-                    </a:stretch>
-                  </pic:blipFill>
-                  <pic:spPr bwMode="auto">
-                    <a:xfrm>
-                      <a:off x="0" y="0"/>
-                      <a:ext cx="5486400" cy="3771900"/>
-                    </a:xfrm>
-                    <a:prstGeom prst="rect">
-                      <a:avLst/>
-                    </a:prstGeom>
-                    <a:noFill/>
-                    <a:ln>
-                      <a:noFill/>
-                    </a:ln>
                   </pic:spPr>
                 </pic:pic>
               </a:graphicData>
@@ -572,7 +521,7 @@
         <mc:AlternateContent>
           <mc:Choice Requires="wps">
             <w:drawing>
-              <wp:inline distT="0" distB="0" distL="0" distR="0" wp14:anchorId="584F33BA" wp14:editId="0E435D65">
+              <wp:inline distT="0" distB="0" distL="0" distR="0" wp14:anchorId="584F33BA" wp14:editId="2A027487">
                 <wp:extent cx="304800" cy="304800"/>
                 <wp:effectExtent l="0" t="0" r="0" b="0"/>
                 <wp:docPr id="652656714" name="Rectangle 1" descr="Mở ảnh"/>
@@ -628,7 +577,7 @@
           </mc:Choice>
           <mc:Fallback>
             <w:pict>
-              <v:rect w14:anchorId="0EA810ED" id="Rectangle 1" o:spid="_x0000_s1026" alt="Mở ảnh" style="width:24pt;height:24pt;visibility:visible;mso-wrap-style:square;mso-left-percent:-10001;mso-top-percent:-10001;mso-position-horizontal:absolute;mso-position-horizontal-relative:char;mso-position-vertical:absolute;mso-position-vertical-relative:line;mso-left-percent:-10001;mso-top-percent:-10001;v-text-anchor:top" o:gfxdata="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" filled="f" stroked="f">
+              <v:rect w14:anchorId="29479B63" id="Rectangle 1" o:spid="_x0000_s1026" alt="Mở ảnh" style="width:24pt;height:24pt;visibility:visible;mso-wrap-style:square;mso-left-percent:-10001;mso-top-percent:-10001;mso-position-horizontal:absolute;mso-position-horizontal-relative:char;mso-position-vertical:absolute;mso-position-vertical-relative:line;mso-left-percent:-10001;mso-top-percent:-10001;v-text-anchor:top" o:gfxdata="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" filled="f" stroked="f">
                 <o:lock v:ext="edit" aspectratio="t"/>
                 <w10:anchorlock/>
               </v:rect>
@@ -699,7 +648,7 @@
           </mc:Choice>
           <mc:Fallback>
             <w:pict>
-              <v:rect w14:anchorId="353FA809" id="Rectangle 2" o:spid="_x0000_s1026" alt="Mở ảnh" style="width:24pt;height:24pt;visibility:visible;mso-wrap-style:square;mso-left-percent:-10001;mso-top-percent:-10001;mso-position-horizontal:absolute;mso-position-horizontal-relative:char;mso-position-vertical:absolute;mso-position-vertical-relative:line;mso-left-percent:-10001;mso-top-percent:-10001;v-text-anchor:top" o:gfxdata="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" filled="f" stroked="f">
+              <v:rect w14:anchorId="1F32697F" id="Rectangle 2" o:spid="_x0000_s1026" alt="Mở ảnh" style="width:24pt;height:24pt;visibility:visible;mso-wrap-style:square;mso-left-percent:-10001;mso-top-percent:-10001;mso-position-horizontal:absolute;mso-position-horizontal-relative:char;mso-position-vertical:absolute;mso-position-vertical-relative:line;mso-left-percent:-10001;mso-top-percent:-10001;v-text-anchor:top" o:gfxdata="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" filled="f" stroked="f">
                 <o:lock v:ext="edit" aspectratio="t"/>
                 <w10:anchorlock/>
               </v:rect>

</xml_diff>